<commit_message>
HD14: optional On-behalf-of requester; guides updated
</commit_message>
<xml_diff>
--- a/docs/End-User-Guide.docx
+++ b/docs/End-User-Guide.docx
@@ -214,6 +214,34 @@
       </w:r>
       <w:r>
         <w:t xml:space="preserve">– what happened and when it started. Error messages and the device name help a lot.</w:t>
+      </w:r>
+    </w:p>
+    <w:p>
+      <w:pPr>
+        <w:numPr>
+          <w:ilvl w:val="0"/>
+          <w:numId w:val="1001"/>
+        </w:numPr>
+        <w:pStyle w:val="Compact"/>
+      </w:pPr>
+      <w:r>
+        <w:t xml:space="preserve">(Optional)</w:t>
+      </w:r>
+      <w:r>
+        <w:t xml:space="preserve"> </w:t>
+      </w:r>
+      <w:r>
+        <w:rPr>
+          <w:bCs/>
+          <w:b/>
+        </w:rPr>
+        <w:t xml:space="preserve">On behalf of</w:t>
+      </w:r>
+      <w:r>
+        <w:t xml:space="preserve"> </w:t>
+      </w:r>
+      <w:r>
+        <w:t xml:space="preserve">– if you are reporting this for a colleague, enter their Branthaven email address. The updates will go to them.</w:t>
       </w:r>
     </w:p>
     <w:p>

</xml_diff>